<commit_message>
fb-595.63 rebase onto pm/land-23: docxref and docxpass use docxzip::pack/unpack (a1's own pack and repack dropped; master already repacks every docx); bap8 opening-brief keeps the 32.2 pt pitch (fb-595.65) in reference.xml; unused have import dropped; a1's ten docx folders re-rendered, check.sh --engine docx 0 failed on each (fb-595.63)
</commit_message>
<xml_diff>
--- a/courts/eighth-circuit/bankruptcy-appellate-panel/opening-brief/usage/OUTPUT-opening-brief.docx
+++ b/courts/eighth-circuit/bankruptcy-appellate-panel/opening-brief/usage/OUTPUT-opening-brief.docx
@@ -2071,6 +2071,50 @@
     </w:pPrDefault>
   </w:docDefaults>
   <w:latentStyles w:defLockedState="0" w:defUIPriority="0" w:defSemiHidden="0" w:defUnhideWhenUsed="0" w:defQFormat="0" w:count="276"/>
+  <w:style w:type="paragraph" w:default="1" w:styleId="Normal">
+    <w:name w:val="Normal"/>
+    <w:qFormat/>
+    <w:pPr>
+      <w:widowControl/>
+      <w:spacing w:before="0" w:after="0" w:line="240" w:lineRule="auto"/>
+      <w:ind w:firstLine="0"/>
+      <w:jc w:val="left"/>
+    </w:pPr>
+    <w:rPr>
+      <w:rFonts w:ascii="Times New Roman" w:hAnsi="Times New Roman" w:eastAsia="Times New Roman" w:cs="Times New Roman"/>
+      <w:sz w:val="28"/>
+      <w:szCs w:val="28"/>
+    </w:rPr>
+  </w:style>
+  <w:style w:type="paragraph" w:styleId="BodyText">
+    <w:name w:val="Body Text"/>
+    <w:basedOn w:val="Normal"/>
+    <w:qFormat/>
+    <w:pPr>
+      <w:widowControl/>
+      <w:spacing w:before="0" w:after="0" w:line="644" w:lineRule="exact"/>
+      <w:ind w:firstLine="720"/>
+    </w:pPr>
+  </w:style>
+  <w:style w:type="paragraph" w:styleId="FirstParagraph">
+    <w:name w:val="First Paragraph"/>
+    <w:basedOn w:val="BodyText"/>
+    <w:next w:val="BodyText"/>
+    <w:qFormat/>
+    <w:pPr>
+      <w:spacing w:before="0" w:after="0" w:line="644" w:lineRule="exact"/>
+      <w:ind w:firstLine="720"/>
+    </w:pPr>
+  </w:style>
+  <w:style w:type="paragraph" w:styleId="Compact">
+    <w:name w:val="Compact"/>
+    <w:basedOn w:val="BodyText"/>
+    <w:qFormat/>
+    <w:pPr>
+      <w:spacing w:before="0" w:after="0" w:line="644" w:lineRule="exact"/>
+      <w:ind w:firstLine="0"/>
+    </w:pPr>
+  </w:style>
   <w:style w:type="paragraph" w:styleId="Title">
     <w:name w:val="Title"/>
     <w:basedOn w:val="Normal"/>
@@ -2520,6 +2564,28 @@
     <w:rPr>
       <w:rFonts w:cstheme="majorBidi"/>
       <w:color w:val="272727" w:themeColor="text1" w:themeTint="D8"/>
+    </w:rPr>
+  </w:style>
+  <w:style w:type="paragraph" w:styleId="BlockText">
+    <w:name w:val="Block Text"/>
+    <w:basedOn w:val="Normal"/>
+    <w:qFormat/>
+    <w:pPr>
+      <w:keepLines/>
+      <w:spacing w:before="280" w:after="280" w:line="240" w:lineRule="auto"/>
+      <w:ind w:left="720" w:right="720" w:firstLine="0"/>
+    </w:pPr>
+  </w:style>
+  <w:style w:type="paragraph" w:styleId="FootnoteText">
+    <w:name w:val="footnote text"/>
+    <w:basedOn w:val="Normal"/>
+    <w:pPr>
+      <w:spacing w:before="0" w:after="140" w:line="240" w:lineRule="auto"/>
+      <w:ind w:firstLine="0"/>
+    </w:pPr>
+    <w:rPr>
+      <w:sz w:val="28"/>
+      <w:szCs w:val="28"/>
     </w:rPr>
   </w:style>
   <w:style w:type="paragraph" w:styleId="FootnoteBlockText">
@@ -2628,6 +2694,18 @@
     <w:name w:val="Section Number"/>
     <w:basedOn w:val="BodyTextChar"/>
   </w:style>
+  <w:style w:type="character" w:styleId="FootnoteReference">
+    <w:name w:val="footnote reference"/>
+    <w:rPr>
+      <w:vertAlign w:val="superscript"/>
+    </w:rPr>
+  </w:style>
+  <w:style w:type="character" w:styleId="Hyperlink">
+    <w:name w:val="Hyperlink"/>
+    <w:rPr>
+      <w:color w:val="000000"/>
+    </w:rPr>
+  </w:style>
   <w:style w:type="paragraph" w:styleId="TOCHeading">
     <w:name w:val="TOC Heading"/>
     <w:basedOn w:val="Heading1"/>
@@ -2644,84 +2722,6 @@
       <w:b w:val="0"/>
       <w:bCs w:val="0"/>
       <w:color w:val="365F91" w:themeColor="accent1" w:themeShade="BF"/>
-    </w:rPr>
-  </w:style>
-  <w:style w:type="paragraph" w:default="1" w:styleId="Normal">
-    <w:name w:val="Normal"/>
-    <w:qFormat/>
-    <w:pPr>
-      <w:widowControl/>
-      <w:spacing w:before="0" w:after="0" w:line="240" w:lineRule="auto"/>
-      <w:ind w:firstLine="0"/>
-      <w:jc w:val="left"/>
-    </w:pPr>
-    <w:rPr>
-      <w:rFonts w:ascii="Times New Roman" w:hAnsi="Times New Roman" w:eastAsia="Times New Roman" w:cs="Times New Roman"/>
-      <w:sz w:val="28"/>
-      <w:szCs w:val="28"/>
-    </w:rPr>
-  </w:style>
-  <w:style w:type="paragraph" w:styleId="BodyText">
-    <w:name w:val="Body Text"/>
-    <w:basedOn w:val="Normal"/>
-    <w:qFormat/>
-    <w:pPr>
-      <w:widowControl/>
-      <w:spacing w:before="0" w:after="0" w:line="644" w:lineRule="exact"/>
-      <w:ind w:firstLine="720"/>
-    </w:pPr>
-  </w:style>
-  <w:style w:type="paragraph" w:styleId="FirstParagraph">
-    <w:name w:val="First Paragraph"/>
-    <w:basedOn w:val="BodyText"/>
-    <w:next w:val="BodyText"/>
-    <w:qFormat/>
-    <w:pPr>
-      <w:spacing w:before="0" w:after="0" w:line="644" w:lineRule="exact"/>
-      <w:ind w:firstLine="720"/>
-    </w:pPr>
-  </w:style>
-  <w:style w:type="paragraph" w:styleId="Compact">
-    <w:name w:val="Compact"/>
-    <w:basedOn w:val="BodyText"/>
-    <w:qFormat/>
-    <w:pPr>
-      <w:spacing w:before="0" w:after="0" w:line="644" w:lineRule="exact"/>
-      <w:ind w:firstLine="0"/>
-    </w:pPr>
-  </w:style>
-  <w:style w:type="paragraph" w:styleId="BlockText">
-    <w:name w:val="Block Text"/>
-    <w:basedOn w:val="Normal"/>
-    <w:qFormat/>
-    <w:pPr>
-      <w:keepLines/>
-      <w:spacing w:before="280" w:after="280" w:line="240" w:lineRule="auto"/>
-      <w:ind w:left="720" w:right="720" w:firstLine="0"/>
-    </w:pPr>
-  </w:style>
-  <w:style w:type="paragraph" w:styleId="FootnoteText">
-    <w:name w:val="footnote text"/>
-    <w:basedOn w:val="Normal"/>
-    <w:pPr>
-      <w:spacing w:before="0" w:after="140" w:line="240" w:lineRule="auto"/>
-      <w:ind w:firstLine="0"/>
-    </w:pPr>
-    <w:rPr>
-      <w:sz w:val="28"/>
-      <w:szCs w:val="28"/>
-    </w:rPr>
-  </w:style>
-  <w:style w:type="character" w:styleId="FootnoteReference">
-    <w:name w:val="footnote reference"/>
-    <w:rPr>
-      <w:vertAlign w:val="superscript"/>
-    </w:rPr>
-  </w:style>
-  <w:style w:type="character" w:styleId="Hyperlink">
-    <w:name w:val="Hyperlink"/>
-    <w:rPr>
-      <w:color w:val="000000"/>
     </w:rPr>
   </w:style>
   <w:style w:type="paragraph" w:styleId="Footer">

</xml_diff>